<commit_message>
wip: test commit for diagnosis
</commit_message>
<xml_diff>
--- a/backend/app/tests/reports/modules/test_analyst_api_documentation.docx
+++ b/backend/app/tests/reports/modules/test_analyst_api_documentation.docx
@@ -12,17 +12,17 @@
     </w:p>
     <w:p>
       <w:r>
-        <w:t>Generated at: 2026-07-10T10:47:00+00:00</w:t>
+        <w:t>Generated at: 2026-08-11T09:27:49+00:00</w:t>
       </w:r>
     </w:p>
     <w:p>
       <w:r>
-        <w:t>Test session started: 2026-07-10T10:46:32+00:00</w:t>
+        <w:t>Test session started: 2026-08-11T09:27:40+00:00</w:t>
       </w:r>
     </w:p>
     <w:p>
       <w:r>
-        <w:t>Pytest exit status: 1</w:t>
+        <w:t>Pytest exit status: 0</w:t>
       </w:r>
     </w:p>
     <w:p>
@@ -88,29 +88,29 @@
           </w:tcPr>
           <w:p>
             <w:r>
-              <w:t>18</w:t>
-            </w:r>
-          </w:p>
-        </w:tc>
-      </w:tr>
-      <w:tr>
-        <w:tc>
-          <w:tcPr>
-            <w:tcW w:w="2400" w:type="dxa"/>
-          </w:tcPr>
-          <w:p>
-            <w:r>
-              <w:t>Passed</w:t>
-            </w:r>
-          </w:p>
-        </w:tc>
-        <w:tc>
-          <w:tcPr>
-            <w:tcW w:w="2400" w:type="dxa"/>
-          </w:tcPr>
-          <w:p>
-            <w:r>
-              <w:t>18</w:t>
+              <w:t>20</w:t>
+            </w:r>
+          </w:p>
+        </w:tc>
+      </w:tr>
+      <w:tr>
+        <w:tc>
+          <w:tcPr>
+            <w:tcW w:w="2400" w:type="dxa"/>
+          </w:tcPr>
+          <w:p>
+            <w:r>
+              <w:t>Passed</w:t>
+            </w:r>
+          </w:p>
+        </w:tc>
+        <w:tc>
+          <w:tcPr>
+            <w:tcW w:w="2400" w:type="dxa"/>
+          </w:tcPr>
+          <w:p>
+            <w:r>
+              <w:t>20</w:t>
             </w:r>
           </w:p>
         </w:tc>
@@ -200,7 +200,7 @@
     </w:p>
     <w:p>
       <w:r>
-        <w:t>Source file: /app/app/tests/test_analyst_api.py</w:t>
+        <w:t>Source file: C:\Users\Chandrasekhar\Downloads\DroneArjuna_final\DroneArjuna\backend\app\tests\test_analyst_api.py</w:t>
       </w:r>
     </w:p>
     <w:tbl>
@@ -348,7 +348,7 @@
           </w:tcPr>
           <w:p>
             <w:r>
-              <w:t>0.401</w:t>
+              <w:t>0.313</w:t>
             </w:r>
           </w:p>
         </w:tc>
@@ -400,27 +400,27 @@
           </w:tcPr>
           <w:p>
             <w:r>
-              <w:t>Cancel a pending job → status becomes 'cancelled' and completed_at is set. | Re-fetch via GET to confirm the state persisted in the store.</w:t>
-            </w:r>
-          </w:p>
-        </w:tc>
-        <w:tc>
-          <w:tcPr>
-            <w:tcW w:w="2400" w:type="dxa"/>
-          </w:tcPr>
-          <w:p>
-            <w:r>
-              <w:t>Passed</w:t>
-            </w:r>
-          </w:p>
-        </w:tc>
-        <w:tc>
-          <w:tcPr>
-            <w:tcW w:w="2400" w:type="dxa"/>
-          </w:tcPr>
-          <w:p>
-            <w:r>
-              <w:t>0.832</w:t>
+              <w:t>Cancel a queued job → status becomes 'cancelled' and completed_at is set. | Re-fetch via GET to confirm the state persisted in the DB.</w:t>
+            </w:r>
+          </w:p>
+        </w:tc>
+        <w:tc>
+          <w:tcPr>
+            <w:tcW w:w="2400" w:type="dxa"/>
+          </w:tcPr>
+          <w:p>
+            <w:r>
+              <w:t>Passed</w:t>
+            </w:r>
+          </w:p>
+        </w:tc>
+        <w:tc>
+          <w:tcPr>
+            <w:tcW w:w="2400" w:type="dxa"/>
+          </w:tcPr>
+          <w:p>
+            <w:r>
+              <w:t>0.623</w:t>
             </w:r>
           </w:p>
         </w:tc>
@@ -492,7 +492,7 @@
           </w:tcPr>
           <w:p>
             <w:r>
-              <w:t>0.013</w:t>
+              <w:t>0.015</w:t>
             </w:r>
           </w:p>
         </w:tc>
@@ -564,7 +564,7 @@
           </w:tcPr>
           <w:p>
             <w:r>
-              <w:t>0.824</w:t>
+              <w:t>0.582</w:t>
             </w:r>
           </w:p>
         </w:tc>
@@ -636,7 +636,7 @@
           </w:tcPr>
           <w:p>
             <w:r>
-              <w:t>0.382</w:t>
+              <w:t>0.294</w:t>
             </w:r>
           </w:p>
         </w:tc>
@@ -708,7 +708,7 @@
           </w:tcPr>
           <w:p>
             <w:r>
-              <w:t>3.689</w:t>
+              <w:t>2.000</w:t>
             </w:r>
           </w:p>
         </w:tc>
@@ -780,7 +780,7 @@
           </w:tcPr>
           <w:p>
             <w:r>
-              <w:t>0.380</w:t>
+              <w:t>0.307</w:t>
             </w:r>
           </w:p>
         </w:tc>
@@ -852,7 +852,7 @@
           </w:tcPr>
           <w:p>
             <w:r>
-              <w:t>0.398</w:t>
+              <w:t>0.298</w:t>
             </w:r>
           </w:p>
         </w:tc>
@@ -924,7 +924,7 @@
           </w:tcPr>
           <w:p>
             <w:r>
-              <w:t>0.469</w:t>
+              <w:t>0.308</w:t>
             </w:r>
           </w:p>
         </w:tc>
@@ -966,6 +966,78 @@
           </w:tcPr>
           <w:p>
             <w:r>
+              <w:t>test_create_job_publishes_to_queue</w:t>
+            </w:r>
+          </w:p>
+        </w:tc>
+        <w:tc>
+          <w:tcPr>
+            <w:tcW w:w="2400" w:type="dxa"/>
+          </w:tcPr>
+          <w:p>
+            <w:r>
+              <w:t>Creating a job must publish {'job_id': ...} to the analyst job routing key.</w:t>
+            </w:r>
+          </w:p>
+        </w:tc>
+        <w:tc>
+          <w:tcPr>
+            <w:tcW w:w="2400" w:type="dxa"/>
+          </w:tcPr>
+          <w:p>
+            <w:r>
+              <w:t>Passed</w:t>
+            </w:r>
+          </w:p>
+        </w:tc>
+        <w:tc>
+          <w:tcPr>
+            <w:tcW w:w="2400" w:type="dxa"/>
+          </w:tcPr>
+          <w:p>
+            <w:r>
+              <w:t>0.303</w:t>
+            </w:r>
+          </w:p>
+        </w:tc>
+        <w:tc>
+          <w:tcPr>
+            <w:tcW w:w="2400" w:type="dxa"/>
+          </w:tcPr>
+          <w:p>
+            <w:r>
+              <w:t>asyncio</w:t>
+            </w:r>
+          </w:p>
+        </w:tc>
+        <w:tc>
+          <w:tcPr>
+            <w:tcW w:w="2400" w:type="dxa"/>
+          </w:tcPr>
+          <w:p>
+            <w:r>
+              <w:t>-</w:t>
+            </w:r>
+          </w:p>
+        </w:tc>
+      </w:tr>
+      <w:tr>
+        <w:tc>
+          <w:tcPr>
+            <w:tcW w:w="2400" w:type="dxa"/>
+          </w:tcPr>
+          <w:p>
+            <w:r>
+              <w:t>11</w:t>
+            </w:r>
+          </w:p>
+        </w:tc>
+        <w:tc>
+          <w:tcPr>
+            <w:tcW w:w="2400" w:type="dxa"/>
+          </w:tcPr>
+          <w:p>
+            <w:r>
               <w:t>test_create_job_unauthenticated_401</w:t>
             </w:r>
           </w:p>
@@ -996,39 +1068,39 @@
           </w:tcPr>
           <w:p>
             <w:r>
-              <w:t>0.014</w:t>
-            </w:r>
-          </w:p>
-        </w:tc>
-        <w:tc>
-          <w:tcPr>
-            <w:tcW w:w="2400" w:type="dxa"/>
-          </w:tcPr>
-          <w:p>
-            <w:r>
-              <w:t>asyncio</w:t>
-            </w:r>
-          </w:p>
-        </w:tc>
-        <w:tc>
-          <w:tcPr>
-            <w:tcW w:w="2400" w:type="dxa"/>
-          </w:tcPr>
-          <w:p>
-            <w:r>
-              <w:t>-</w:t>
-            </w:r>
-          </w:p>
-        </w:tc>
-      </w:tr>
-      <w:tr>
-        <w:tc>
-          <w:tcPr>
-            <w:tcW w:w="2400" w:type="dxa"/>
-          </w:tcPr>
-          <w:p>
-            <w:r>
-              <w:t>11</w:t>
+              <w:t>0.015</w:t>
+            </w:r>
+          </w:p>
+        </w:tc>
+        <w:tc>
+          <w:tcPr>
+            <w:tcW w:w="2400" w:type="dxa"/>
+          </w:tcPr>
+          <w:p>
+            <w:r>
+              <w:t>asyncio</w:t>
+            </w:r>
+          </w:p>
+        </w:tc>
+        <w:tc>
+          <w:tcPr>
+            <w:tcW w:w="2400" w:type="dxa"/>
+          </w:tcPr>
+          <w:p>
+            <w:r>
+              <w:t>-</w:t>
+            </w:r>
+          </w:p>
+        </w:tc>
+      </w:tr>
+      <w:tr>
+        <w:tc>
+          <w:tcPr>
+            <w:tcW w:w="2400" w:type="dxa"/>
+          </w:tcPr>
+          <w:p>
+            <w:r>
+              <w:t>12</w:t>
             </w:r>
           </w:p>
         </w:tc>
@@ -1068,39 +1140,39 @@
           </w:tcPr>
           <w:p>
             <w:r>
-              <w:t>0.378</w:t>
-            </w:r>
-          </w:p>
-        </w:tc>
-        <w:tc>
-          <w:tcPr>
-            <w:tcW w:w="2400" w:type="dxa"/>
-          </w:tcPr>
-          <w:p>
-            <w:r>
-              <w:t>asyncio</w:t>
-            </w:r>
-          </w:p>
-        </w:tc>
-        <w:tc>
-          <w:tcPr>
-            <w:tcW w:w="2400" w:type="dxa"/>
-          </w:tcPr>
-          <w:p>
-            <w:r>
-              <w:t>-</w:t>
-            </w:r>
-          </w:p>
-        </w:tc>
-      </w:tr>
-      <w:tr>
-        <w:tc>
-          <w:tcPr>
-            <w:tcW w:w="2400" w:type="dxa"/>
-          </w:tcPr>
-          <w:p>
-            <w:r>
-              <w:t>12</w:t>
+              <w:t>0.299</w:t>
+            </w:r>
+          </w:p>
+        </w:tc>
+        <w:tc>
+          <w:tcPr>
+            <w:tcW w:w="2400" w:type="dxa"/>
+          </w:tcPr>
+          <w:p>
+            <w:r>
+              <w:t>asyncio</w:t>
+            </w:r>
+          </w:p>
+        </w:tc>
+        <w:tc>
+          <w:tcPr>
+            <w:tcW w:w="2400" w:type="dxa"/>
+          </w:tcPr>
+          <w:p>
+            <w:r>
+              <w:t>-</w:t>
+            </w:r>
+          </w:p>
+        </w:tc>
+      </w:tr>
+      <w:tr>
+        <w:tc>
+          <w:tcPr>
+            <w:tcW w:w="2400" w:type="dxa"/>
+          </w:tcPr>
+          <w:p>
+            <w:r>
+              <w:t>13</w:t>
             </w:r>
           </w:p>
         </w:tc>
@@ -1140,39 +1212,39 @@
           </w:tcPr>
           <w:p>
             <w:r>
-              <w:t>0.399</w:t>
-            </w:r>
-          </w:p>
-        </w:tc>
-        <w:tc>
-          <w:tcPr>
-            <w:tcW w:w="2400" w:type="dxa"/>
-          </w:tcPr>
-          <w:p>
-            <w:r>
-              <w:t>asyncio</w:t>
-            </w:r>
-          </w:p>
-        </w:tc>
-        <w:tc>
-          <w:tcPr>
-            <w:tcW w:w="2400" w:type="dxa"/>
-          </w:tcPr>
-          <w:p>
-            <w:r>
-              <w:t>-</w:t>
-            </w:r>
-          </w:p>
-        </w:tc>
-      </w:tr>
-      <w:tr>
-        <w:tc>
-          <w:tcPr>
-            <w:tcW w:w="2400" w:type="dxa"/>
-          </w:tcPr>
-          <w:p>
-            <w:r>
-              <w:t>13</w:t>
+              <w:t>0.306</w:t>
+            </w:r>
+          </w:p>
+        </w:tc>
+        <w:tc>
+          <w:tcPr>
+            <w:tcW w:w="2400" w:type="dxa"/>
+          </w:tcPr>
+          <w:p>
+            <w:r>
+              <w:t>asyncio</w:t>
+            </w:r>
+          </w:p>
+        </w:tc>
+        <w:tc>
+          <w:tcPr>
+            <w:tcW w:w="2400" w:type="dxa"/>
+          </w:tcPr>
+          <w:p>
+            <w:r>
+              <w:t>-</w:t>
+            </w:r>
+          </w:p>
+        </w:tc>
+      </w:tr>
+      <w:tr>
+        <w:tc>
+          <w:tcPr>
+            <w:tcW w:w="2400" w:type="dxa"/>
+          </w:tcPr>
+          <w:p>
+            <w:r>
+              <w:t>14</w:t>
             </w:r>
           </w:p>
         </w:tc>
@@ -1212,39 +1284,39 @@
           </w:tcPr>
           <w:p>
             <w:r>
-              <w:t>0.488</w:t>
-            </w:r>
-          </w:p>
-        </w:tc>
-        <w:tc>
-          <w:tcPr>
-            <w:tcW w:w="2400" w:type="dxa"/>
-          </w:tcPr>
-          <w:p>
-            <w:r>
-              <w:t>asyncio</w:t>
-            </w:r>
-          </w:p>
-        </w:tc>
-        <w:tc>
-          <w:tcPr>
-            <w:tcW w:w="2400" w:type="dxa"/>
-          </w:tcPr>
-          <w:p>
-            <w:r>
-              <w:t>-</w:t>
-            </w:r>
-          </w:p>
-        </w:tc>
-      </w:tr>
-      <w:tr>
-        <w:tc>
-          <w:tcPr>
-            <w:tcW w:w="2400" w:type="dxa"/>
-          </w:tcPr>
-          <w:p>
-            <w:r>
-              <w:t>14</w:t>
+              <w:t>0.338</w:t>
+            </w:r>
+          </w:p>
+        </w:tc>
+        <w:tc>
+          <w:tcPr>
+            <w:tcW w:w="2400" w:type="dxa"/>
+          </w:tcPr>
+          <w:p>
+            <w:r>
+              <w:t>asyncio</w:t>
+            </w:r>
+          </w:p>
+        </w:tc>
+        <w:tc>
+          <w:tcPr>
+            <w:tcW w:w="2400" w:type="dxa"/>
+          </w:tcPr>
+          <w:p>
+            <w:r>
+              <w:t>-</w:t>
+            </w:r>
+          </w:p>
+        </w:tc>
+      </w:tr>
+      <w:tr>
+        <w:tc>
+          <w:tcPr>
+            <w:tcW w:w="2400" w:type="dxa"/>
+          </w:tcPr>
+          <w:p>
+            <w:r>
+              <w:t>15</w:t>
             </w:r>
           </w:p>
         </w:tc>
@@ -1284,39 +1356,39 @@
           </w:tcPr>
           <w:p>
             <w:r>
-              <w:t>0.771</w:t>
-            </w:r>
-          </w:p>
-        </w:tc>
-        <w:tc>
-          <w:tcPr>
-            <w:tcW w:w="2400" w:type="dxa"/>
-          </w:tcPr>
-          <w:p>
-            <w:r>
-              <w:t>asyncio</w:t>
-            </w:r>
-          </w:p>
-        </w:tc>
-        <w:tc>
-          <w:tcPr>
-            <w:tcW w:w="2400" w:type="dxa"/>
-          </w:tcPr>
-          <w:p>
-            <w:r>
-              <w:t>-</w:t>
-            </w:r>
-          </w:p>
-        </w:tc>
-      </w:tr>
-      <w:tr>
-        <w:tc>
-          <w:tcPr>
-            <w:tcW w:w="2400" w:type="dxa"/>
-          </w:tcPr>
-          <w:p>
-            <w:r>
-              <w:t>15</w:t>
+              <w:t>0.588</w:t>
+            </w:r>
+          </w:p>
+        </w:tc>
+        <w:tc>
+          <w:tcPr>
+            <w:tcW w:w="2400" w:type="dxa"/>
+          </w:tcPr>
+          <w:p>
+            <w:r>
+              <w:t>asyncio</w:t>
+            </w:r>
+          </w:p>
+        </w:tc>
+        <w:tc>
+          <w:tcPr>
+            <w:tcW w:w="2400" w:type="dxa"/>
+          </w:tcPr>
+          <w:p>
+            <w:r>
+              <w:t>-</w:t>
+            </w:r>
+          </w:p>
+        </w:tc>
+      </w:tr>
+      <w:tr>
+        <w:tc>
+          <w:tcPr>
+            <w:tcW w:w="2400" w:type="dxa"/>
+          </w:tcPr>
+          <w:p>
+            <w:r>
+              <w:t>16</w:t>
             </w:r>
           </w:p>
         </w:tc>
@@ -1356,39 +1428,39 @@
           </w:tcPr>
           <w:p>
             <w:r>
-              <w:t>0.035</w:t>
-            </w:r>
-          </w:p>
-        </w:tc>
-        <w:tc>
-          <w:tcPr>
-            <w:tcW w:w="2400" w:type="dxa"/>
-          </w:tcPr>
-          <w:p>
-            <w:r>
-              <w:t>asyncio</w:t>
-            </w:r>
-          </w:p>
-        </w:tc>
-        <w:tc>
-          <w:tcPr>
-            <w:tcW w:w="2400" w:type="dxa"/>
-          </w:tcPr>
-          <w:p>
-            <w:r>
-              <w:t>-</w:t>
-            </w:r>
-          </w:p>
-        </w:tc>
-      </w:tr>
-      <w:tr>
-        <w:tc>
-          <w:tcPr>
-            <w:tcW w:w="2400" w:type="dxa"/>
-          </w:tcPr>
-          <w:p>
-            <w:r>
-              <w:t>16</w:t>
+              <w:t>0.015</w:t>
+            </w:r>
+          </w:p>
+        </w:tc>
+        <w:tc>
+          <w:tcPr>
+            <w:tcW w:w="2400" w:type="dxa"/>
+          </w:tcPr>
+          <w:p>
+            <w:r>
+              <w:t>asyncio</w:t>
+            </w:r>
+          </w:p>
+        </w:tc>
+        <w:tc>
+          <w:tcPr>
+            <w:tcW w:w="2400" w:type="dxa"/>
+          </w:tcPr>
+          <w:p>
+            <w:r>
+              <w:t>-</w:t>
+            </w:r>
+          </w:p>
+        </w:tc>
+      </w:tr>
+      <w:tr>
+        <w:tc>
+          <w:tcPr>
+            <w:tcW w:w="2400" w:type="dxa"/>
+          </w:tcPr>
+          <w:p>
+            <w:r>
+              <w:t>17</w:t>
             </w:r>
           </w:p>
         </w:tc>
@@ -1428,39 +1500,39 @@
           </w:tcPr>
           <w:p>
             <w:r>
-              <w:t>0.796</w:t>
-            </w:r>
-          </w:p>
-        </w:tc>
-        <w:tc>
-          <w:tcPr>
-            <w:tcW w:w="2400" w:type="dxa"/>
-          </w:tcPr>
-          <w:p>
-            <w:r>
-              <w:t>asyncio</w:t>
-            </w:r>
-          </w:p>
-        </w:tc>
-        <w:tc>
-          <w:tcPr>
-            <w:tcW w:w="2400" w:type="dxa"/>
-          </w:tcPr>
-          <w:p>
-            <w:r>
-              <w:t>-</w:t>
-            </w:r>
-          </w:p>
-        </w:tc>
-      </w:tr>
-      <w:tr>
-        <w:tc>
-          <w:tcPr>
-            <w:tcW w:w="2400" w:type="dxa"/>
-          </w:tcPr>
-          <w:p>
-            <w:r>
-              <w:t>17</w:t>
+              <w:t>0.585</w:t>
+            </w:r>
+          </w:p>
+        </w:tc>
+        <w:tc>
+          <w:tcPr>
+            <w:tcW w:w="2400" w:type="dxa"/>
+          </w:tcPr>
+          <w:p>
+            <w:r>
+              <w:t>asyncio</w:t>
+            </w:r>
+          </w:p>
+        </w:tc>
+        <w:tc>
+          <w:tcPr>
+            <w:tcW w:w="2400" w:type="dxa"/>
+          </w:tcPr>
+          <w:p>
+            <w:r>
+              <w:t>-</w:t>
+            </w:r>
+          </w:p>
+        </w:tc>
+      </w:tr>
+      <w:tr>
+        <w:tc>
+          <w:tcPr>
+            <w:tcW w:w="2400" w:type="dxa"/>
+          </w:tcPr>
+          <w:p>
+            <w:r>
+              <w:t>18</w:t>
             </w:r>
           </w:p>
         </w:tc>
@@ -1500,39 +1572,111 @@
           </w:tcPr>
           <w:p>
             <w:r>
-              <w:t>0.786</w:t>
-            </w:r>
-          </w:p>
-        </w:tc>
-        <w:tc>
-          <w:tcPr>
-            <w:tcW w:w="2400" w:type="dxa"/>
-          </w:tcPr>
-          <w:p>
-            <w:r>
-              <w:t>asyncio</w:t>
-            </w:r>
-          </w:p>
-        </w:tc>
-        <w:tc>
-          <w:tcPr>
-            <w:tcW w:w="2400" w:type="dxa"/>
-          </w:tcPr>
-          <w:p>
-            <w:r>
-              <w:t>-</w:t>
-            </w:r>
-          </w:p>
-        </w:tc>
-      </w:tr>
-      <w:tr>
-        <w:tc>
-          <w:tcPr>
-            <w:tcW w:w="2400" w:type="dxa"/>
-          </w:tcPr>
-          <w:p>
-            <w:r>
-              <w:t>18</w:t>
+              <w:t>0.593</w:t>
+            </w:r>
+          </w:p>
+        </w:tc>
+        <w:tc>
+          <w:tcPr>
+            <w:tcW w:w="2400" w:type="dxa"/>
+          </w:tcPr>
+          <w:p>
+            <w:r>
+              <w:t>asyncio</w:t>
+            </w:r>
+          </w:p>
+        </w:tc>
+        <w:tc>
+          <w:tcPr>
+            <w:tcW w:w="2400" w:type="dxa"/>
+          </w:tcPr>
+          <w:p>
+            <w:r>
+              <w:t>-</w:t>
+            </w:r>
+          </w:p>
+        </w:tc>
+      </w:tr>
+      <w:tr>
+        <w:tc>
+          <w:tcPr>
+            <w:tcW w:w="2400" w:type="dxa"/>
+          </w:tcPr>
+          <w:p>
+            <w:r>
+              <w:t>19</w:t>
+            </w:r>
+          </w:p>
+        </w:tc>
+        <w:tc>
+          <w:tcPr>
+            <w:tcW w:w="2400" w:type="dxa"/>
+          </w:tcPr>
+          <w:p>
+            <w:r>
+              <w:t>test_list_jobs_filter_by_status</w:t>
+            </w:r>
+          </w:p>
+        </w:tc>
+        <w:tc>
+          <w:tcPr>
+            <w:tcW w:w="2400" w:type="dxa"/>
+          </w:tcPr>
+          <w:p>
+            <w:r>
+              <w:t>status filter returns only jobs in that state.</w:t>
+            </w:r>
+          </w:p>
+        </w:tc>
+        <w:tc>
+          <w:tcPr>
+            <w:tcW w:w="2400" w:type="dxa"/>
+          </w:tcPr>
+          <w:p>
+            <w:r>
+              <w:t>Passed</w:t>
+            </w:r>
+          </w:p>
+        </w:tc>
+        <w:tc>
+          <w:tcPr>
+            <w:tcW w:w="2400" w:type="dxa"/>
+          </w:tcPr>
+          <w:p>
+            <w:r>
+              <w:t>0.616</w:t>
+            </w:r>
+          </w:p>
+        </w:tc>
+        <w:tc>
+          <w:tcPr>
+            <w:tcW w:w="2400" w:type="dxa"/>
+          </w:tcPr>
+          <w:p>
+            <w:r>
+              <w:t>asyncio</w:t>
+            </w:r>
+          </w:p>
+        </w:tc>
+        <w:tc>
+          <w:tcPr>
+            <w:tcW w:w="2400" w:type="dxa"/>
+          </w:tcPr>
+          <w:p>
+            <w:r>
+              <w:t>-</w:t>
+            </w:r>
+          </w:p>
+        </w:tc>
+      </w:tr>
+      <w:tr>
+        <w:tc>
+          <w:tcPr>
+            <w:tcW w:w="2400" w:type="dxa"/>
+          </w:tcPr>
+          <w:p>
+            <w:r>
+              <w:t>20</w:t>
             </w:r>
           </w:p>
         </w:tc>
@@ -1572,7 +1716,7 @@
           </w:tcPr>
           <w:p>
             <w:r>
-              <w:t>0.013</w:t>
+              <w:t>0.015</w:t>
             </w:r>
           </w:p>
         </w:tc>

</xml_diff>